<commit_message>
update cubic model and project folder
</commit_message>
<xml_diff>
--- a/cv/zongrun_cv_sci.docx
+++ b/cv/zongrun_cv_sci.docx
@@ -1138,23 +1138,7 @@
                 <w:sz w:val="24"/>
                 <w:szCs w:val="24"/>
               </w:rPr>
-              <w:t xml:space="preserve">(PI: Dr. John </w:t>
-            </w:r>
-            <w:proofErr w:type="spellStart"/>
-            <w:r>
-              <w:rPr>
-                <w:sz w:val="24"/>
-                <w:szCs w:val="24"/>
-              </w:rPr>
-              <w:t>Volckens</w:t>
-            </w:r>
-            <w:proofErr w:type="spellEnd"/>
-            <w:r>
-              <w:rPr>
-                <w:sz w:val="24"/>
-                <w:szCs w:val="24"/>
-              </w:rPr>
-              <w:t>)</w:t>
+              <w:t>(PI: Dr. John Volckens)</w:t>
             </w:r>
           </w:p>
         </w:tc>
@@ -2582,7 +2566,57 @@
           <w:szCs w:val="22"/>
           <w:u w:val="none"/>
         </w:rPr>
-        <w:t>, Qian, Y., Hu, Y., Vasilakos, P., Odman, M. T., … Russell, A. G. Comparison of Chemical Transport Model and Observation Derived Ozone–NOx–VOC Isopleths for the South Coast Air Basin of California.</w:t>
+        <w:t>, Qian, Y., Hu, Y., Vasilakos, P., Odman, M. T., … Russell, A. G. Comparison of Chemical Transport Model and Observation Derived Ozone–NOx–VOC Isopleths for the South Coast Air Basin of California</w:t>
+      </w:r>
+      <w:r>
+        <w:rPr>
+          <w:b w:val="0"/>
+          <w:bCs w:val="0"/>
+          <w:sz w:val="22"/>
+          <w:szCs w:val="22"/>
+          <w:u w:val="none"/>
+        </w:rPr>
+        <w:t xml:space="preserve"> </w:t>
+      </w:r>
+      <w:r>
+        <w:rPr>
+          <w:b w:val="0"/>
+          <w:bCs w:val="0"/>
+          <w:sz w:val="22"/>
+          <w:szCs w:val="22"/>
+          <w:u w:val="none"/>
+        </w:rPr>
+        <w:t xml:space="preserve">(submitted to </w:t>
+      </w:r>
+      <w:r>
+        <w:rPr>
+          <w:b w:val="0"/>
+          <w:bCs w:val="0"/>
+          <w:sz w:val="22"/>
+          <w:szCs w:val="22"/>
+          <w:u w:val="none"/>
+        </w:rPr>
+        <w:t>ES&amp;T Air</w:t>
+      </w:r>
+      <w:r>
+        <w:rPr>
+          <w:b w:val="0"/>
+          <w:bCs w:val="0"/>
+          <w:sz w:val="22"/>
+          <w:szCs w:val="22"/>
+          <w:u w:val="none"/>
+        </w:rPr>
+        <w:t>)</w:t>
+      </w:r>
+      <w:r>
+        <w:rPr>
+          <w:b w:val="0"/>
+          <w:bCs w:val="0"/>
+          <w:sz w:val="22"/>
+          <w:szCs w:val="22"/>
+          <w:u w:val="none"/>
+        </w:rPr>
+        <w:t>.</w:t>
       </w:r>
     </w:p>
     <w:p>
@@ -2836,29 +2870,7 @@
           <w:szCs w:val="22"/>
           <w:u w:val="none"/>
         </w:rPr>
-        <w:t xml:space="preserve">, C., … </w:t>
-      </w:r>
-      <w:proofErr w:type="spellStart"/>
-      <w:r>
-        <w:rPr>
-          <w:b w:val="0"/>
-          <w:bCs w:val="0"/>
-          <w:sz w:val="22"/>
-          <w:szCs w:val="22"/>
-          <w:u w:val="none"/>
-        </w:rPr>
-        <w:t>Wellenius</w:t>
-      </w:r>
-      <w:proofErr w:type="spellEnd"/>
-      <w:r>
-        <w:rPr>
-          <w:b w:val="0"/>
-          <w:bCs w:val="0"/>
-          <w:sz w:val="22"/>
-          <w:szCs w:val="22"/>
-          <w:u w:val="none"/>
-        </w:rPr>
-        <w:t>, G. A. Risk of emergency department visits associated with O3 attributable to prescribed burning differs from total O3 exposures in the Southeastern US</w:t>
+        <w:t>, C., … Wellenius, G. A. Risk of emergency department visits associated with O3 attributable to prescribed burning differs from total O3 exposures in the Southeastern US</w:t>
       </w:r>
       <w:r>
         <w:rPr>
@@ -3811,29 +3823,7 @@
           <w:szCs w:val="22"/>
           <w:u w:val="none"/>
         </w:rPr>
-        <w:t xml:space="preserve">, C., Russell, A. G., Kinney, P. L., Odman, M. T., and </w:t>
-      </w:r>
-      <w:proofErr w:type="spellStart"/>
-      <w:r>
-        <w:rPr>
-          <w:b w:val="0"/>
-          <w:bCs w:val="0"/>
-          <w:sz w:val="22"/>
-          <w:szCs w:val="22"/>
-          <w:u w:val="none"/>
-        </w:rPr>
-        <w:t>Wellenius</w:t>
-      </w:r>
-      <w:proofErr w:type="spellEnd"/>
-      <w:r>
-        <w:rPr>
-          <w:b w:val="0"/>
-          <w:bCs w:val="0"/>
-          <w:sz w:val="22"/>
-          <w:szCs w:val="22"/>
-          <w:u w:val="none"/>
-        </w:rPr>
-        <w:t>, G. A.: Associations between PM2.5 from prescribed burning and emergency department visits in 11 Southeastern US states, Environment International, 203, 109770, https://doi.org/10.1016/j.envint.2025.109770, 2025.</w:t>
+        <w:t>, C., Russell, A. G., Kinney, P. L., Odman, M. T., and Wellenius, G. A.: Associations between PM2.5 from prescribed burning and emergency department visits in 11 Southeastern US states, Environment International, 203, 109770, https://doi.org/10.1016/j.envint.2025.109770, 2025.</w:t>
       </w:r>
     </w:p>
     <w:p>
@@ -4296,6 +4286,7 @@
           <w:szCs w:val="22"/>
           <w:u w:val="none"/>
         </w:rPr>
+        <w:lastRenderedPageBreak/>
         <w:t xml:space="preserve">Huang, R., </w:t>
       </w:r>
       <w:r>
@@ -4314,18 +4305,7 @@
           <w:szCs w:val="22"/>
           <w:u w:val="none"/>
         </w:rPr>
-        <w:t xml:space="preserve">., Ivey, C. E., Zhai, X., Shi, G., Mulholland, J. A., . . . Russell, A. G. (2022). Application of </w:t>
-      </w:r>
-      <w:r>
-        <w:rPr>
-          <w:b w:val="0"/>
-          <w:bCs w:val="0"/>
-          <w:sz w:val="22"/>
-          <w:szCs w:val="22"/>
-          <w:u w:val="none"/>
-        </w:rPr>
-        <w:lastRenderedPageBreak/>
-        <w:t xml:space="preserve">an improved gas-constrained source apportionment method using data fused fields: A case study in North Carolina, USA. Atmospheric Environment, 276, 119031. </w:t>
+        <w:t xml:space="preserve">., Ivey, C. E., Zhai, X., Shi, G., Mulholland, J. A., . . . Russell, A. G. (2022). Application of an improved gas-constrained source apportionment method using data fused fields: A case study in North Carolina, USA. Atmospheric Environment, 276, 119031. </w:t>
       </w:r>
       <w:proofErr w:type="spellStart"/>
       <w:proofErr w:type="gramStart"/>
@@ -4372,7 +4352,7 @@
           <w:spacing w:val="-2"/>
           <w:shd w:val="clear" w:color="auto" w:fill="D9D9D9"/>
         </w:rPr>
-        <w:t xml:space="preserve">Conference </w:t>
+        <w:t>Conference</w:t>
       </w:r>
       <w:r>
         <w:rPr>
@@ -4380,7 +4360,7 @@
           <w:spacing w:val="-2"/>
           <w:shd w:val="clear" w:color="auto" w:fill="D9D9D9"/>
         </w:rPr>
-        <w:t>Presentation</w:t>
+        <w:t xml:space="preserve"> Poster</w:t>
       </w:r>
       <w:r>
         <w:rPr>
@@ -4388,7 +4368,15 @@
           <w:spacing w:val="-2"/>
           <w:shd w:val="clear" w:color="auto" w:fill="D9D9D9"/>
         </w:rPr>
-        <w:t>s</w:t>
+        <w:t xml:space="preserve"> &amp; </w:t>
+      </w:r>
+      <w:r>
+        <w:rPr>
+          <w:color w:val="000000"/>
+          <w:spacing w:val="-2"/>
+          <w:shd w:val="clear" w:color="auto" w:fill="D9D9D9"/>
+        </w:rPr>
+        <w:t>Presentations</w:t>
       </w:r>
       <w:r>
         <w:rPr>
@@ -4434,17 +4422,7 @@
           <w:szCs w:val="22"/>
           <w:u w:val="none"/>
         </w:rPr>
-        <w:t>;</w:t>
-      </w:r>
-      <w:r>
-        <w:rPr>
-          <w:b w:val="0"/>
-          <w:bCs w:val="0"/>
-          <w:sz w:val="22"/>
-          <w:szCs w:val="22"/>
-          <w:u w:val="none"/>
-        </w:rPr>
-        <w:t xml:space="preserve"> Hu, Y.; Russell, A.G</w:t>
+        <w:t>; Hu, Y.; O’Neill, S.; El Asmar, R.; Huey, L.G.; Tanner, D.; Weber, R.J.; Russell, A.G</w:t>
       </w:r>
       <w:r>
         <w:rPr>
@@ -4464,17 +4442,47 @@
           <w:szCs w:val="22"/>
           <w:u w:val="none"/>
         </w:rPr>
-        <w:t xml:space="preserve">Odman, M.T. The </w:t>
-      </w:r>
-      <w:r>
-        <w:rPr>
-          <w:b w:val="0"/>
-          <w:bCs w:val="0"/>
-          <w:sz w:val="22"/>
-          <w:szCs w:val="22"/>
-          <w:u w:val="none"/>
-        </w:rPr>
-        <w:t>Integrating Fire Behavior Models and Chemical Transport Models: A Case Study of Coupling WRF-SFIRE with CMAQ</w:t>
+        <w:t>Odman, M.T</w:t>
+      </w:r>
+      <w:r>
+        <w:rPr>
+          <w:b w:val="0"/>
+          <w:bCs w:val="0"/>
+          <w:sz w:val="22"/>
+          <w:szCs w:val="22"/>
+          <w:u w:val="none"/>
+        </w:rPr>
+        <w:t>.</w:t>
+      </w:r>
+      <w:r>
+        <w:rPr>
+          <w:b w:val="0"/>
+          <w:bCs w:val="0"/>
+          <w:sz w:val="22"/>
+          <w:szCs w:val="22"/>
+          <w:u w:val="none"/>
+        </w:rPr>
+        <w:t xml:space="preserve"> </w:t>
+      </w:r>
+      <w:r>
+        <w:rPr>
+          <w:b w:val="0"/>
+          <w:bCs w:val="0"/>
+          <w:sz w:val="22"/>
+          <w:szCs w:val="22"/>
+          <w:u w:val="none"/>
+        </w:rPr>
+        <w:t>I</w:t>
+      </w:r>
+      <w:r>
+        <w:rPr>
+          <w:b w:val="0"/>
+          <w:bCs w:val="0"/>
+          <w:sz w:val="22"/>
+          <w:szCs w:val="22"/>
+          <w:u w:val="none"/>
+        </w:rPr>
+        <w:t>ntegrating Fire Behavior Models with Chemical Transport Models: A Case Study of Coupling CMAQ with WRF-SFIRE</w:t>
       </w:r>
       <w:r>
         <w:rPr>
@@ -4494,27 +4502,67 @@
           <w:szCs w:val="22"/>
           <w:u w:val="none"/>
         </w:rPr>
-        <w:t>American Geophysical Union 2023 Annual Meeting, 202</w:t>
-      </w:r>
-      <w:r>
-        <w:rPr>
-          <w:b w:val="0"/>
-          <w:bCs w:val="0"/>
-          <w:sz w:val="22"/>
-          <w:szCs w:val="22"/>
-          <w:u w:val="none"/>
-        </w:rPr>
-        <w:t>4</w:t>
-      </w:r>
-      <w:r>
-        <w:rPr>
-          <w:b w:val="0"/>
-          <w:bCs w:val="0"/>
-          <w:sz w:val="22"/>
-          <w:szCs w:val="22"/>
-          <w:u w:val="none"/>
-        </w:rPr>
-        <w:t>.</w:t>
+        <w:t>American Meteorological Society 10</w:t>
+      </w:r>
+      <w:r>
+        <w:rPr>
+          <w:b w:val="0"/>
+          <w:bCs w:val="0"/>
+          <w:sz w:val="22"/>
+          <w:szCs w:val="22"/>
+          <w:u w:val="none"/>
+        </w:rPr>
+        <w:t>6</w:t>
+      </w:r>
+      <w:r>
+        <w:rPr>
+          <w:b w:val="0"/>
+          <w:bCs w:val="0"/>
+          <w:sz w:val="22"/>
+          <w:szCs w:val="22"/>
+          <w:u w:val="none"/>
+        </w:rPr>
+        <w:t xml:space="preserve">th Annual Meeting, </w:t>
+      </w:r>
+      <w:r>
+        <w:rPr>
+          <w:b w:val="0"/>
+          <w:bCs w:val="0"/>
+          <w:sz w:val="22"/>
+          <w:szCs w:val="22"/>
+          <w:u w:val="none"/>
+        </w:rPr>
+        <w:t>Houston</w:t>
+      </w:r>
+      <w:r>
+        <w:rPr>
+          <w:b w:val="0"/>
+          <w:bCs w:val="0"/>
+          <w:sz w:val="22"/>
+          <w:szCs w:val="22"/>
+          <w:u w:val="none"/>
+        </w:rPr>
+        <w:t xml:space="preserve">, </w:t>
+      </w:r>
+      <w:r>
+        <w:rPr>
+          <w:b w:val="0"/>
+          <w:bCs w:val="0"/>
+          <w:sz w:val="22"/>
+          <w:szCs w:val="22"/>
+          <w:u w:val="none"/>
+        </w:rPr>
+        <w:t xml:space="preserve">TX </w:t>
+      </w:r>
+      <w:r>
+        <w:rPr>
+          <w:b w:val="0"/>
+          <w:bCs w:val="0"/>
+          <w:sz w:val="22"/>
+          <w:szCs w:val="22"/>
+          <w:u w:val="none"/>
+        </w:rPr>
+        <w:t>(oral).</w:t>
       </w:r>
     </w:p>
     <w:p>
@@ -4539,16 +4587,6 @@
       </w:pPr>
       <w:r>
         <w:rPr>
-          <w:b w:val="0"/>
-          <w:bCs w:val="0"/>
-          <w:sz w:val="22"/>
-          <w:szCs w:val="22"/>
-          <w:u w:val="none"/>
-        </w:rPr>
-        <w:t xml:space="preserve">Odman, M.T.; </w:t>
-      </w:r>
-      <w:r>
-        <w:rPr>
           <w:sz w:val="22"/>
           <w:szCs w:val="22"/>
           <w:u w:val="none"/>
@@ -4563,17 +4601,107 @@
           <w:szCs w:val="22"/>
           <w:u w:val="none"/>
         </w:rPr>
-        <w:t>;</w:t>
-      </w:r>
-      <w:r>
-        <w:rPr>
-          <w:b w:val="0"/>
-          <w:bCs w:val="0"/>
-          <w:sz w:val="22"/>
-          <w:szCs w:val="22"/>
-          <w:u w:val="none"/>
-        </w:rPr>
-        <w:t xml:space="preserve"> Maji, K.J.; Hu, Y.; Vaidyanathan, A.; Russell, A.G. The Tradeoffs Between Wildfires and Prescribed Fires: A Case Study of 2016 Gatlinburg Fires. Community Modeling and Analysis System Conference, Chapel Hill, NC, 2024.</w:t>
+        <w:t>; Hu, Y.; O’Neill, S.; El Asmar, R.; Huey, L.G.; Tanner, D.; Weber, R.J.; Russell, A.G</w:t>
+      </w:r>
+      <w:r>
+        <w:rPr>
+          <w:b w:val="0"/>
+          <w:bCs w:val="0"/>
+          <w:sz w:val="22"/>
+          <w:szCs w:val="22"/>
+          <w:u w:val="none"/>
+        </w:rPr>
+        <w:t xml:space="preserve">; </w:t>
+      </w:r>
+      <w:r>
+        <w:rPr>
+          <w:b w:val="0"/>
+          <w:bCs w:val="0"/>
+          <w:sz w:val="22"/>
+          <w:szCs w:val="22"/>
+          <w:u w:val="none"/>
+        </w:rPr>
+        <w:t>Odman, M.T.</w:t>
+      </w:r>
+      <w:r>
+        <w:rPr>
+          <w:b w:val="0"/>
+          <w:bCs w:val="0"/>
+          <w:sz w:val="22"/>
+          <w:szCs w:val="22"/>
+          <w:u w:val="none"/>
+        </w:rPr>
+        <w:t xml:space="preserve"> I</w:t>
+      </w:r>
+      <w:r>
+        <w:rPr>
+          <w:b w:val="0"/>
+          <w:bCs w:val="0"/>
+          <w:sz w:val="22"/>
+          <w:szCs w:val="22"/>
+          <w:u w:val="none"/>
+        </w:rPr>
+        <w:t>ntegrating Fire Behavior Models with Chemical Transport Models: A Case Study of Coupling CMAQ with WRF-SFIRE</w:t>
+      </w:r>
+      <w:r>
+        <w:rPr>
+          <w:b w:val="0"/>
+          <w:bCs w:val="0"/>
+          <w:sz w:val="22"/>
+          <w:szCs w:val="22"/>
+          <w:u w:val="none"/>
+        </w:rPr>
+        <w:t xml:space="preserve">. </w:t>
+      </w:r>
+      <w:r>
+        <w:rPr>
+          <w:b w:val="0"/>
+          <w:bCs w:val="0"/>
+          <w:sz w:val="22"/>
+          <w:szCs w:val="22"/>
+          <w:u w:val="none"/>
+        </w:rPr>
+        <w:t xml:space="preserve">American Geophysical Union Annual Meeting, </w:t>
+      </w:r>
+      <w:r>
+        <w:rPr>
+          <w:b w:val="0"/>
+          <w:bCs w:val="0"/>
+          <w:sz w:val="22"/>
+          <w:szCs w:val="22"/>
+          <w:u w:val="none"/>
+        </w:rPr>
+        <w:t>2025</w:t>
+      </w:r>
+      <w:r>
+        <w:rPr>
+          <w:b w:val="0"/>
+          <w:bCs w:val="0"/>
+          <w:sz w:val="22"/>
+          <w:szCs w:val="22"/>
+          <w:u w:val="none"/>
+        </w:rPr>
+        <w:t xml:space="preserve"> (</w:t>
+      </w:r>
+      <w:r>
+        <w:rPr>
+          <w:b w:val="0"/>
+          <w:bCs w:val="0"/>
+          <w:sz w:val="22"/>
+          <w:szCs w:val="22"/>
+          <w:u w:val="none"/>
+        </w:rPr>
+        <w:t>poster</w:t>
+      </w:r>
+      <w:r>
+        <w:rPr>
+          <w:b w:val="0"/>
+          <w:bCs w:val="0"/>
+          <w:sz w:val="22"/>
+          <w:szCs w:val="22"/>
+          <w:u w:val="none"/>
+        </w:rPr>
+        <w:t>).</w:t>
       </w:r>
     </w:p>
     <w:p>
@@ -4612,7 +4740,87 @@
           <w:szCs w:val="22"/>
           <w:u w:val="none"/>
         </w:rPr>
-        <w:t>; Odman, M.T.; Hu, Y.; Russell, A.G. An Analysis of Uncertain Wind Impacts in Coupled Fire-Atmosphere Model WRF-SFIRE. Community Modeling and Analysis System Conference, Chapel Hill, NC, 2024.</w:t>
+        <w:t>;</w:t>
+      </w:r>
+      <w:r>
+        <w:rPr>
+          <w:b w:val="0"/>
+          <w:bCs w:val="0"/>
+          <w:sz w:val="22"/>
+          <w:szCs w:val="22"/>
+          <w:u w:val="none"/>
+        </w:rPr>
+        <w:t xml:space="preserve"> Hu, Y.; Russell, A.G</w:t>
+      </w:r>
+      <w:r>
+        <w:rPr>
+          <w:b w:val="0"/>
+          <w:bCs w:val="0"/>
+          <w:sz w:val="22"/>
+          <w:szCs w:val="22"/>
+          <w:u w:val="none"/>
+        </w:rPr>
+        <w:t xml:space="preserve">; </w:t>
+      </w:r>
+      <w:r>
+        <w:rPr>
+          <w:b w:val="0"/>
+          <w:bCs w:val="0"/>
+          <w:sz w:val="22"/>
+          <w:szCs w:val="22"/>
+          <w:u w:val="none"/>
+        </w:rPr>
+        <w:t xml:space="preserve">Odman, M.T. </w:t>
+      </w:r>
+      <w:r>
+        <w:rPr>
+          <w:b w:val="0"/>
+          <w:bCs w:val="0"/>
+          <w:sz w:val="22"/>
+          <w:szCs w:val="22"/>
+          <w:u w:val="none"/>
+        </w:rPr>
+        <w:t>I</w:t>
+      </w:r>
+      <w:r>
+        <w:rPr>
+          <w:b w:val="0"/>
+          <w:bCs w:val="0"/>
+          <w:sz w:val="22"/>
+          <w:szCs w:val="22"/>
+          <w:u w:val="none"/>
+        </w:rPr>
+        <w:t>ntegrating Fire Behavior Models with Chemical Transport Models: A Case Study of Coupling CMAQ with WRF-SFIRE</w:t>
+      </w:r>
+      <w:r>
+        <w:rPr>
+          <w:b w:val="0"/>
+          <w:bCs w:val="0"/>
+          <w:sz w:val="22"/>
+          <w:szCs w:val="22"/>
+          <w:u w:val="none"/>
+        </w:rPr>
+        <w:t xml:space="preserve">. </w:t>
+      </w:r>
+      <w:r>
+        <w:rPr>
+          <w:b w:val="0"/>
+          <w:bCs w:val="0"/>
+          <w:sz w:val="22"/>
+          <w:szCs w:val="22"/>
+          <w:u w:val="none"/>
+        </w:rPr>
+        <w:t xml:space="preserve">American Geophysical Union Annual Meeting, </w:t>
+      </w:r>
+      <w:r>
+        <w:rPr>
+          <w:b w:val="0"/>
+          <w:bCs w:val="0"/>
+          <w:sz w:val="22"/>
+          <w:szCs w:val="22"/>
+          <w:u w:val="none"/>
+        </w:rPr>
+        <w:t>2025 (oral).</w:t>
       </w:r>
     </w:p>
     <w:p>
@@ -4651,7 +4859,97 @@
           <w:szCs w:val="22"/>
           <w:u w:val="none"/>
         </w:rPr>
-        <w:t>; Odman, M.T.; Hu, Y.; O’Neill, S.; El Asmar, R.; Huey, L.G.; Tanner, D.; Weber, R.J.; Russell, A.G. Comparisons of High-Spatiotemporal Resolution Air Quality Modeling Systems for Simulating Prescribed Burning at Military Bases in the Southeastern United States. American Meteorological Society 104th Annual Meeting, Baltimore, MD, 2024.</w:t>
+        <w:t>;</w:t>
+      </w:r>
+      <w:r>
+        <w:rPr>
+          <w:b w:val="0"/>
+          <w:bCs w:val="0"/>
+          <w:sz w:val="22"/>
+          <w:szCs w:val="22"/>
+          <w:u w:val="none"/>
+        </w:rPr>
+        <w:t xml:space="preserve"> Hu, Y.; Russell, A.G</w:t>
+      </w:r>
+      <w:r>
+        <w:rPr>
+          <w:b w:val="0"/>
+          <w:bCs w:val="0"/>
+          <w:sz w:val="22"/>
+          <w:szCs w:val="22"/>
+          <w:u w:val="none"/>
+        </w:rPr>
+        <w:t xml:space="preserve">; </w:t>
+      </w:r>
+      <w:r>
+        <w:rPr>
+          <w:b w:val="0"/>
+          <w:bCs w:val="0"/>
+          <w:sz w:val="22"/>
+          <w:szCs w:val="22"/>
+          <w:u w:val="none"/>
+        </w:rPr>
+        <w:t xml:space="preserve">Odman, M.T. </w:t>
+      </w:r>
+      <w:r>
+        <w:rPr>
+          <w:b w:val="0"/>
+          <w:bCs w:val="0"/>
+          <w:sz w:val="22"/>
+          <w:szCs w:val="22"/>
+          <w:u w:val="none"/>
+        </w:rPr>
+        <w:t>Integrating Fire Behavior Models and Chemical Transport Models: A Case Study of Coupling WRF-SFIRE with CMAQ</w:t>
+      </w:r>
+      <w:r>
+        <w:rPr>
+          <w:b w:val="0"/>
+          <w:bCs w:val="0"/>
+          <w:sz w:val="22"/>
+          <w:szCs w:val="22"/>
+          <w:u w:val="none"/>
+        </w:rPr>
+        <w:t xml:space="preserve">. </w:t>
+      </w:r>
+      <w:r>
+        <w:rPr>
+          <w:b w:val="0"/>
+          <w:bCs w:val="0"/>
+          <w:sz w:val="22"/>
+          <w:szCs w:val="22"/>
+          <w:u w:val="none"/>
+        </w:rPr>
+        <w:t>American Geophysical Union Annual Meeting, 202</w:t>
+      </w:r>
+      <w:r>
+        <w:rPr>
+          <w:b w:val="0"/>
+          <w:bCs w:val="0"/>
+          <w:sz w:val="22"/>
+          <w:szCs w:val="22"/>
+          <w:u w:val="none"/>
+        </w:rPr>
+        <w:t>4</w:t>
+      </w:r>
+      <w:r>
+        <w:rPr>
+          <w:b w:val="0"/>
+          <w:bCs w:val="0"/>
+          <w:sz w:val="22"/>
+          <w:szCs w:val="22"/>
+          <w:u w:val="none"/>
+        </w:rPr>
+        <w:t xml:space="preserve"> (oral)</w:t>
+      </w:r>
+      <w:r>
+        <w:rPr>
+          <w:b w:val="0"/>
+          <w:bCs w:val="0"/>
+          <w:sz w:val="22"/>
+          <w:szCs w:val="22"/>
+          <w:u w:val="none"/>
+        </w:rPr>
+        <w:t>.</w:t>
       </w:r>
     </w:p>
     <w:p>
@@ -4682,7 +4980,7 @@
           <w:szCs w:val="22"/>
           <w:u w:val="none"/>
         </w:rPr>
-        <w:t xml:space="preserve">Odman, M.T.; Maji, K.J.; </w:t>
+        <w:t xml:space="preserve">Odman, M.T.; </w:t>
       </w:r>
       <w:r>
         <w:rPr>
@@ -4700,7 +4998,37 @@
           <w:szCs w:val="22"/>
           <w:u w:val="none"/>
         </w:rPr>
-        <w:t>; Hu, Y.; Russell, A.G.; Vaidyanathan, A. Impact of Prescribed Fire on Particulate Matter Levels in the Southeastern US from 2015 to 2020. American Geophysical Union 2023 Annual Meeting, 2023.</w:t>
+        <w:t>;</w:t>
+      </w:r>
+      <w:r>
+        <w:rPr>
+          <w:b w:val="0"/>
+          <w:bCs w:val="0"/>
+          <w:sz w:val="22"/>
+          <w:szCs w:val="22"/>
+          <w:u w:val="none"/>
+        </w:rPr>
+        <w:t xml:space="preserve"> Maji, K.J.; Hu, Y.; Vaidyanathan, A.; Russell, A.G. The Tradeoffs Between Wildfires and Prescribed Fires: A Case Study of 2016 Gatlinburg Fires. Community Modeling and Analysis System Conference, Chapel Hill, NC, 2024</w:t>
+      </w:r>
+      <w:r>
+        <w:rPr>
+          <w:b w:val="0"/>
+          <w:bCs w:val="0"/>
+          <w:sz w:val="22"/>
+          <w:szCs w:val="22"/>
+          <w:u w:val="none"/>
+        </w:rPr>
+        <w:t xml:space="preserve"> (oral)</w:t>
+      </w:r>
+      <w:r>
+        <w:rPr>
+          <w:b w:val="0"/>
+          <w:bCs w:val="0"/>
+          <w:sz w:val="22"/>
+          <w:szCs w:val="22"/>
+          <w:u w:val="none"/>
+        </w:rPr>
+        <w:t>.</w:t>
       </w:r>
     </w:p>
     <w:p>
@@ -4725,16 +5053,6 @@
       </w:pPr>
       <w:r>
         <w:rPr>
-          <w:b w:val="0"/>
-          <w:bCs w:val="0"/>
-          <w:sz w:val="22"/>
-          <w:szCs w:val="22"/>
-          <w:u w:val="none"/>
-        </w:rPr>
-        <w:t xml:space="preserve">Odman, M.T.; Maji, K.J.; </w:t>
-      </w:r>
-      <w:r>
-        <w:rPr>
           <w:sz w:val="22"/>
           <w:szCs w:val="22"/>
           <w:u w:val="none"/>
@@ -4749,51 +5067,27 @@
           <w:szCs w:val="22"/>
           <w:u w:val="none"/>
         </w:rPr>
-        <w:t xml:space="preserve">; Hu, Y.; Russell, A.G.; Stowell, J.; </w:t>
-      </w:r>
-      <w:proofErr w:type="spellStart"/>
-      <w:r>
-        <w:rPr>
-          <w:b w:val="0"/>
-          <w:bCs w:val="0"/>
-          <w:sz w:val="22"/>
-          <w:szCs w:val="22"/>
-          <w:u w:val="none"/>
-        </w:rPr>
-        <w:t>Milando</w:t>
-      </w:r>
-      <w:proofErr w:type="spellEnd"/>
-      <w:r>
-        <w:rPr>
-          <w:b w:val="0"/>
-          <w:bCs w:val="0"/>
-          <w:sz w:val="22"/>
-          <w:szCs w:val="22"/>
-          <w:u w:val="none"/>
-        </w:rPr>
-        <w:t xml:space="preserve">, C.; Kinney, P.L.; </w:t>
-      </w:r>
-      <w:proofErr w:type="spellStart"/>
-      <w:r>
-        <w:rPr>
-          <w:b w:val="0"/>
-          <w:bCs w:val="0"/>
-          <w:sz w:val="22"/>
-          <w:szCs w:val="22"/>
-          <w:u w:val="none"/>
-        </w:rPr>
-        <w:t>Wellenius</w:t>
-      </w:r>
-      <w:proofErr w:type="spellEnd"/>
-      <w:r>
-        <w:rPr>
-          <w:b w:val="0"/>
-          <w:bCs w:val="0"/>
-          <w:sz w:val="22"/>
-          <w:szCs w:val="22"/>
-          <w:u w:val="none"/>
-        </w:rPr>
-        <w:t>, G.; Vaidyanathan, A. Impact of Prescribed Fire on Air Quality in Southeastern US during 2015–2020. Health Effects Institute Annual Conference 2023, 2023.</w:t>
+        <w:t>; Odman, M.T.; Hu, Y.; Russell, A.G. An Analysis of Uncertain Wind Impacts in Coupled Fire-Atmosphere Model WRF-SFIRE. Community Modeling and Analysis System Conference, Chapel Hill, NC, 2024</w:t>
+      </w:r>
+      <w:r>
+        <w:rPr>
+          <w:b w:val="0"/>
+          <w:bCs w:val="0"/>
+          <w:sz w:val="22"/>
+          <w:szCs w:val="22"/>
+          <w:u w:val="none"/>
+        </w:rPr>
+        <w:t xml:space="preserve"> (oral)</w:t>
+      </w:r>
+      <w:r>
+        <w:rPr>
+          <w:b w:val="0"/>
+          <w:bCs w:val="0"/>
+          <w:sz w:val="22"/>
+          <w:szCs w:val="22"/>
+          <w:u w:val="none"/>
+        </w:rPr>
+        <w:t>.</w:t>
       </w:r>
     </w:p>
     <w:p>
@@ -4832,7 +5126,27 @@
           <w:szCs w:val="22"/>
           <w:u w:val="none"/>
         </w:rPr>
-        <w:t>; Odman, M.T.; Hu, Y.; Russell, A.G. Integrating Fire Behavior Models and Chemical Transport Models: A case study of Coupling WRF-SFIRE with CMAQ. Community Modeling and Analysis System Conference, Chapel Hill, NC, 2023.</w:t>
+        <w:t>; Odman, M.T.; Hu, Y.; O’Neill, S.; El Asmar, R.; Huey, L.G.; Tanner, D.; Weber, R.J.; Russell, A.G. Comparisons of High-Spatiotemporal Resolution Air Quality Modeling Systems for Simulating Prescribed Burning at Military Bases in the Southeastern United States. American Meteorological Society 104th Annual Meeting, Baltimore, MD, 2024</w:t>
+      </w:r>
+      <w:r>
+        <w:rPr>
+          <w:b w:val="0"/>
+          <w:bCs w:val="0"/>
+          <w:sz w:val="22"/>
+          <w:szCs w:val="22"/>
+          <w:u w:val="none"/>
+        </w:rPr>
+        <w:t xml:space="preserve"> (oral)</w:t>
+      </w:r>
+      <w:r>
+        <w:rPr>
+          <w:b w:val="0"/>
+          <w:bCs w:val="0"/>
+          <w:sz w:val="22"/>
+          <w:szCs w:val="22"/>
+          <w:u w:val="none"/>
+        </w:rPr>
+        <w:t>.</w:t>
       </w:r>
     </w:p>
     <w:p>
@@ -4857,6 +5171,16 @@
       </w:pPr>
       <w:r>
         <w:rPr>
+          <w:b w:val="0"/>
+          <w:bCs w:val="0"/>
+          <w:sz w:val="22"/>
+          <w:szCs w:val="22"/>
+          <w:u w:val="none"/>
+        </w:rPr>
+        <w:t xml:space="preserve">Odman, M.T.; Maji, K.J.; </w:t>
+      </w:r>
+      <w:r>
+        <w:rPr>
           <w:sz w:val="22"/>
           <w:szCs w:val="22"/>
           <w:u w:val="none"/>
@@ -4871,7 +5195,27 @@
           <w:szCs w:val="22"/>
           <w:u w:val="none"/>
         </w:rPr>
-        <w:t>; Hu, Y.; Odman, M.T.; Russell, A.G. Modeling the Regional Air Quality Impacts of Prescribed Burning at a Military Base in Southeastern United States. American Meteorological Society 103rd Annual Meeting, Denver, CO, 2023.</w:t>
+        <w:t>; Hu, Y.; Russell, A.G.; Vaidyanathan, A. Impact of Prescribed Fire on Particulate Matter Levels in the Southeastern US from 2015 to 2020. American Geophysical Union Annual Meeting, 2023</w:t>
+      </w:r>
+      <w:r>
+        <w:rPr>
+          <w:b w:val="0"/>
+          <w:bCs w:val="0"/>
+          <w:sz w:val="22"/>
+          <w:szCs w:val="22"/>
+          <w:u w:val="none"/>
+        </w:rPr>
+        <w:t xml:space="preserve"> (poster)</w:t>
+      </w:r>
+      <w:r>
+        <w:rPr>
+          <w:b w:val="0"/>
+          <w:bCs w:val="0"/>
+          <w:sz w:val="22"/>
+          <w:szCs w:val="22"/>
+          <w:u w:val="none"/>
+        </w:rPr>
+        <w:t>.</w:t>
       </w:r>
     </w:p>
     <w:p>
@@ -4902,7 +5246,7 @@
           <w:szCs w:val="22"/>
           <w:u w:val="none"/>
         </w:rPr>
-        <w:t xml:space="preserve">El Asmar, R.; </w:t>
+        <w:t xml:space="preserve">Odman, M.T.; Maji, K.J.; </w:t>
       </w:r>
       <w:r>
         <w:rPr>
@@ -4920,7 +5264,69 @@
           <w:szCs w:val="22"/>
           <w:u w:val="none"/>
         </w:rPr>
-        <w:t>; Tanner, D.J.; Hu, Y.; O’Neill, S.; Huey, L.G.; Odman, M.T.; Weber, R.J. Studying the Emissions and Evolution of Smoke from Prescribed Fires Using Multiple Fixed Sites. American Geophysical Union 2023 Annual Meeting, 2023.</w:t>
+        <w:t xml:space="preserve">; Hu, Y.; Russell, A.G.; Stowell, J.; </w:t>
+      </w:r>
+      <w:proofErr w:type="spellStart"/>
+      <w:r>
+        <w:rPr>
+          <w:b w:val="0"/>
+          <w:bCs w:val="0"/>
+          <w:sz w:val="22"/>
+          <w:szCs w:val="22"/>
+          <w:u w:val="none"/>
+        </w:rPr>
+        <w:t>Milando</w:t>
+      </w:r>
+      <w:proofErr w:type="spellEnd"/>
+      <w:r>
+        <w:rPr>
+          <w:b w:val="0"/>
+          <w:bCs w:val="0"/>
+          <w:sz w:val="22"/>
+          <w:szCs w:val="22"/>
+          <w:u w:val="none"/>
+        </w:rPr>
+        <w:t>, C.; Kinney, P.L.; Wellenius, G.; Vaidyanathan, A. Impact of Prescribed Fire on Air Quality in Southeastern US during 2015–2020. Health Effects Institute Annual Conference, 2023</w:t>
+      </w:r>
+      <w:r>
+        <w:rPr>
+          <w:b w:val="0"/>
+          <w:bCs w:val="0"/>
+          <w:sz w:val="22"/>
+          <w:szCs w:val="22"/>
+          <w:u w:val="none"/>
+        </w:rPr>
+        <w:t xml:space="preserve"> (</w:t>
+      </w:r>
+      <w:r>
+        <w:rPr>
+          <w:b w:val="0"/>
+          <w:bCs w:val="0"/>
+          <w:sz w:val="22"/>
+          <w:szCs w:val="22"/>
+          <w:u w:val="none"/>
+        </w:rPr>
+        <w:t>poster</w:t>
+      </w:r>
+      <w:r>
+        <w:rPr>
+          <w:b w:val="0"/>
+          <w:bCs w:val="0"/>
+          <w:sz w:val="22"/>
+          <w:szCs w:val="22"/>
+          <w:u w:val="none"/>
+        </w:rPr>
+        <w:t>)</w:t>
+      </w:r>
+      <w:r>
+        <w:rPr>
+          <w:b w:val="0"/>
+          <w:bCs w:val="0"/>
+          <w:sz w:val="22"/>
+          <w:szCs w:val="22"/>
+          <w:u w:val="none"/>
+        </w:rPr>
+        <w:t>.</w:t>
       </w:r>
     </w:p>
     <w:p>
@@ -4945,16 +5351,6 @@
       </w:pPr>
       <w:r>
         <w:rPr>
-          <w:b w:val="0"/>
-          <w:bCs w:val="0"/>
-          <w:sz w:val="22"/>
-          <w:szCs w:val="22"/>
-          <w:u w:val="none"/>
-        </w:rPr>
-        <w:t xml:space="preserve">Odman, M.T.; Maji, K.J.; </w:t>
-      </w:r>
-      <w:r>
-        <w:rPr>
           <w:sz w:val="22"/>
           <w:szCs w:val="22"/>
           <w:u w:val="none"/>
@@ -4969,51 +5365,27 @@
           <w:szCs w:val="22"/>
           <w:u w:val="none"/>
         </w:rPr>
-        <w:t xml:space="preserve">; Hu, Y.; Russell, A.G.; Stowell, J.; </w:t>
-      </w:r>
-      <w:proofErr w:type="spellStart"/>
-      <w:r>
-        <w:rPr>
-          <w:b w:val="0"/>
-          <w:bCs w:val="0"/>
-          <w:sz w:val="22"/>
-          <w:szCs w:val="22"/>
-          <w:u w:val="none"/>
-        </w:rPr>
-        <w:t>Milando</w:t>
-      </w:r>
-      <w:proofErr w:type="spellEnd"/>
-      <w:r>
-        <w:rPr>
-          <w:b w:val="0"/>
-          <w:bCs w:val="0"/>
-          <w:sz w:val="22"/>
-          <w:szCs w:val="22"/>
-          <w:u w:val="none"/>
-        </w:rPr>
-        <w:t xml:space="preserve">, C.; Kinney, P.L.; </w:t>
-      </w:r>
-      <w:proofErr w:type="spellStart"/>
-      <w:r>
-        <w:rPr>
-          <w:b w:val="0"/>
-          <w:bCs w:val="0"/>
-          <w:sz w:val="22"/>
-          <w:szCs w:val="22"/>
-          <w:u w:val="none"/>
-        </w:rPr>
-        <w:t>Wellenius</w:t>
-      </w:r>
-      <w:proofErr w:type="spellEnd"/>
-      <w:r>
-        <w:rPr>
-          <w:b w:val="0"/>
-          <w:bCs w:val="0"/>
-          <w:sz w:val="22"/>
-          <w:szCs w:val="22"/>
-          <w:u w:val="none"/>
-        </w:rPr>
-        <w:t>, G.; Vaidyanathan, A. Uncertainties in Prescribed Fire Emissions and Related PM 2.5 Estimates in Southeastern United States. American Geophysical Union 2022 Annual Meeting, 2022.</w:t>
+        <w:t>; Odman, M.T.; Hu, Y.; Russell, A.G. Integrating Fire Behavior Models and Chemical Transport Models: A case study of Coupling WRF-SFIRE with CMAQ. Community Modeling and Analysis System Conference, Chapel Hill, NC, 2023</w:t>
+      </w:r>
+      <w:r>
+        <w:rPr>
+          <w:b w:val="0"/>
+          <w:bCs w:val="0"/>
+          <w:sz w:val="22"/>
+          <w:szCs w:val="22"/>
+          <w:u w:val="none"/>
+        </w:rPr>
+        <w:t xml:space="preserve"> (oral)</w:t>
+      </w:r>
+      <w:r>
+        <w:rPr>
+          <w:b w:val="0"/>
+          <w:bCs w:val="0"/>
+          <w:sz w:val="22"/>
+          <w:szCs w:val="22"/>
+          <w:u w:val="none"/>
+        </w:rPr>
+        <w:t>.</w:t>
       </w:r>
     </w:p>
     <w:p>
@@ -5038,16 +5410,6 @@
       </w:pPr>
       <w:r>
         <w:rPr>
-          <w:b w:val="0"/>
-          <w:bCs w:val="0"/>
-          <w:sz w:val="22"/>
-          <w:szCs w:val="22"/>
-          <w:u w:val="none"/>
-        </w:rPr>
-        <w:t xml:space="preserve">Maji, K.J.; </w:t>
-      </w:r>
-      <w:r>
-        <w:rPr>
           <w:sz w:val="22"/>
           <w:szCs w:val="22"/>
           <w:u w:val="none"/>
@@ -5062,51 +5424,27 @@
           <w:szCs w:val="22"/>
           <w:u w:val="none"/>
         </w:rPr>
-        <w:t xml:space="preserve">; Vaidyanathan, A.; Hu, Y.; Stowell, J.D.; </w:t>
-      </w:r>
-      <w:proofErr w:type="spellStart"/>
-      <w:r>
-        <w:rPr>
-          <w:b w:val="0"/>
-          <w:bCs w:val="0"/>
-          <w:sz w:val="22"/>
-          <w:szCs w:val="22"/>
-          <w:u w:val="none"/>
-        </w:rPr>
-        <w:t>Milando</w:t>
-      </w:r>
-      <w:proofErr w:type="spellEnd"/>
-      <w:r>
-        <w:rPr>
-          <w:b w:val="0"/>
-          <w:bCs w:val="0"/>
-          <w:sz w:val="22"/>
-          <w:szCs w:val="22"/>
-          <w:u w:val="none"/>
-        </w:rPr>
-        <w:t xml:space="preserve">, C.; </w:t>
-      </w:r>
-      <w:proofErr w:type="spellStart"/>
-      <w:r>
-        <w:rPr>
-          <w:b w:val="0"/>
-          <w:bCs w:val="0"/>
-          <w:sz w:val="22"/>
-          <w:szCs w:val="22"/>
-          <w:u w:val="none"/>
-        </w:rPr>
-        <w:t>Wellenius</w:t>
-      </w:r>
-      <w:proofErr w:type="spellEnd"/>
-      <w:r>
-        <w:rPr>
-          <w:b w:val="0"/>
-          <w:bCs w:val="0"/>
-          <w:sz w:val="22"/>
-          <w:szCs w:val="22"/>
-          <w:u w:val="none"/>
-        </w:rPr>
-        <w:t>, G.; Kinney, P.L.; Russell, A.G.; Odman, M.T. Prescribed Fire Emissions and their Impacts on PM2.5 in Southeastern United States. Community Modeling and Analysis System Conference, Chapel Hill, NC, 2022.</w:t>
+        <w:t>; Hu, Y.; Odman, M.T.; Russell, A.G. Modeling the Regional Air Quality Impacts of Prescribed Burning at a Military Base in Southeastern United States. American Meteorological Society 103rd Annual Meeting, Denver, CO, 2023</w:t>
+      </w:r>
+      <w:r>
+        <w:rPr>
+          <w:b w:val="0"/>
+          <w:bCs w:val="0"/>
+          <w:sz w:val="22"/>
+          <w:szCs w:val="22"/>
+          <w:u w:val="none"/>
+        </w:rPr>
+        <w:t xml:space="preserve"> (oral)</w:t>
+      </w:r>
+      <w:r>
+        <w:rPr>
+          <w:b w:val="0"/>
+          <w:bCs w:val="0"/>
+          <w:sz w:val="22"/>
+          <w:szCs w:val="22"/>
+          <w:u w:val="none"/>
+        </w:rPr>
+        <w:t>.</w:t>
       </w:r>
     </w:p>
     <w:p>
@@ -5131,6 +5469,16 @@
       </w:pPr>
       <w:r>
         <w:rPr>
+          <w:b w:val="0"/>
+          <w:bCs w:val="0"/>
+          <w:sz w:val="22"/>
+          <w:szCs w:val="22"/>
+          <w:u w:val="none"/>
+        </w:rPr>
+        <w:t xml:space="preserve">El Asmar, R.; </w:t>
+      </w:r>
+      <w:r>
+        <w:rPr>
           <w:sz w:val="22"/>
           <w:szCs w:val="22"/>
           <w:u w:val="none"/>
@@ -5145,7 +5493,268 @@
           <w:szCs w:val="22"/>
           <w:u w:val="none"/>
         </w:rPr>
-        <w:t>; Odman, M.T.; Hu, Y.; Russell, A.G. Comparisons of Air Quality Models for Prescribed Burning Simulations at a Military Base in Southeastern United States. Community Modeling and Analysis System Conference, Chapel Hill, NC, 2022.</w:t>
+        <w:t>; Tanner, D.J.; Hu, Y.; O’Neill, S.; Huey, L.G.; Odman, M.T.; Weber, R.J. Studying the Emissions and Evolution of Smoke from Prescribed Fires Using Multiple Fixed Sites. American Geophysical Union Annual Meeting, 2023</w:t>
+      </w:r>
+      <w:r>
+        <w:rPr>
+          <w:b w:val="0"/>
+          <w:bCs w:val="0"/>
+          <w:sz w:val="22"/>
+          <w:szCs w:val="22"/>
+          <w:u w:val="none"/>
+        </w:rPr>
+        <w:t xml:space="preserve"> (poster)</w:t>
+      </w:r>
+      <w:r>
+        <w:rPr>
+          <w:b w:val="0"/>
+          <w:bCs w:val="0"/>
+          <w:sz w:val="22"/>
+          <w:szCs w:val="22"/>
+          <w:u w:val="none"/>
+        </w:rPr>
+        <w:t>.</w:t>
+      </w:r>
+    </w:p>
+    <w:p>
+      <w:pPr>
+        <w:pStyle w:val="Heading1"/>
+        <w:numPr>
+          <w:ilvl w:val="0"/>
+          <w:numId w:val="3"/>
+        </w:numPr>
+        <w:tabs>
+          <w:tab w:val="left" w:pos="10466"/>
+        </w:tabs>
+        <w:spacing w:before="0"/>
+        <w:jc w:val="both"/>
+        <w:rPr>
+          <w:b w:val="0"/>
+          <w:bCs w:val="0"/>
+          <w:sz w:val="22"/>
+          <w:szCs w:val="22"/>
+          <w:u w:val="none"/>
+        </w:rPr>
+      </w:pPr>
+      <w:r>
+        <w:rPr>
+          <w:b w:val="0"/>
+          <w:bCs w:val="0"/>
+          <w:sz w:val="22"/>
+          <w:szCs w:val="22"/>
+          <w:u w:val="none"/>
+        </w:rPr>
+        <w:t xml:space="preserve">Odman, M.T.; Maji, K.J.; </w:t>
+      </w:r>
+      <w:r>
+        <w:rPr>
+          <w:sz w:val="22"/>
+          <w:szCs w:val="22"/>
+          <w:u w:val="none"/>
+        </w:rPr>
+        <w:t>Li, Z.</w:t>
+      </w:r>
+      <w:r>
+        <w:rPr>
+          <w:b w:val="0"/>
+          <w:bCs w:val="0"/>
+          <w:sz w:val="22"/>
+          <w:szCs w:val="22"/>
+          <w:u w:val="none"/>
+        </w:rPr>
+        <w:t xml:space="preserve">; Hu, Y.; Russell, A.G.; Stowell, J.; </w:t>
+      </w:r>
+      <w:proofErr w:type="spellStart"/>
+      <w:r>
+        <w:rPr>
+          <w:b w:val="0"/>
+          <w:bCs w:val="0"/>
+          <w:sz w:val="22"/>
+          <w:szCs w:val="22"/>
+          <w:u w:val="none"/>
+        </w:rPr>
+        <w:t>Milando</w:t>
+      </w:r>
+      <w:proofErr w:type="spellEnd"/>
+      <w:r>
+        <w:rPr>
+          <w:b w:val="0"/>
+          <w:bCs w:val="0"/>
+          <w:sz w:val="22"/>
+          <w:szCs w:val="22"/>
+          <w:u w:val="none"/>
+        </w:rPr>
+        <w:t>, C.; Kinney, P.L.; Wellenius, G.; Vaidyanathan, A. Uncertainties in Prescribed Fire Emissions and Related PM 2.5 Estimates in Southeastern United States. American Geophysical Union Annual Meeting, 2022</w:t>
+      </w:r>
+      <w:r>
+        <w:rPr>
+          <w:b w:val="0"/>
+          <w:bCs w:val="0"/>
+          <w:sz w:val="22"/>
+          <w:szCs w:val="22"/>
+          <w:u w:val="none"/>
+        </w:rPr>
+        <w:t xml:space="preserve"> (oral)</w:t>
+      </w:r>
+      <w:r>
+        <w:rPr>
+          <w:b w:val="0"/>
+          <w:bCs w:val="0"/>
+          <w:sz w:val="22"/>
+          <w:szCs w:val="22"/>
+          <w:u w:val="none"/>
+        </w:rPr>
+        <w:t>.</w:t>
+      </w:r>
+    </w:p>
+    <w:p>
+      <w:pPr>
+        <w:pStyle w:val="Heading1"/>
+        <w:numPr>
+          <w:ilvl w:val="0"/>
+          <w:numId w:val="3"/>
+        </w:numPr>
+        <w:tabs>
+          <w:tab w:val="left" w:pos="10466"/>
+        </w:tabs>
+        <w:spacing w:before="0"/>
+        <w:jc w:val="both"/>
+        <w:rPr>
+          <w:b w:val="0"/>
+          <w:bCs w:val="0"/>
+          <w:sz w:val="22"/>
+          <w:szCs w:val="22"/>
+          <w:u w:val="none"/>
+        </w:rPr>
+      </w:pPr>
+      <w:r>
+        <w:rPr>
+          <w:b w:val="0"/>
+          <w:bCs w:val="0"/>
+          <w:sz w:val="22"/>
+          <w:szCs w:val="22"/>
+          <w:u w:val="none"/>
+        </w:rPr>
+        <w:t xml:space="preserve">Maji, K.J.; </w:t>
+      </w:r>
+      <w:r>
+        <w:rPr>
+          <w:sz w:val="22"/>
+          <w:szCs w:val="22"/>
+          <w:u w:val="none"/>
+        </w:rPr>
+        <w:t>Li, Z.</w:t>
+      </w:r>
+      <w:r>
+        <w:rPr>
+          <w:b w:val="0"/>
+          <w:bCs w:val="0"/>
+          <w:sz w:val="22"/>
+          <w:szCs w:val="22"/>
+          <w:u w:val="none"/>
+        </w:rPr>
+        <w:t xml:space="preserve">; Vaidyanathan, A.; Hu, Y.; Stowell, J.D.; </w:t>
+      </w:r>
+      <w:proofErr w:type="spellStart"/>
+      <w:r>
+        <w:rPr>
+          <w:b w:val="0"/>
+          <w:bCs w:val="0"/>
+          <w:sz w:val="22"/>
+          <w:szCs w:val="22"/>
+          <w:u w:val="none"/>
+        </w:rPr>
+        <w:t>Milando</w:t>
+      </w:r>
+      <w:proofErr w:type="spellEnd"/>
+      <w:r>
+        <w:rPr>
+          <w:b w:val="0"/>
+          <w:bCs w:val="0"/>
+          <w:sz w:val="22"/>
+          <w:szCs w:val="22"/>
+          <w:u w:val="none"/>
+        </w:rPr>
+        <w:t>, C.; Wellenius, G.; Kinney, P.L.; Russell, A.G.; Odman, M.T. Prescribed Fire Emissions and their Impacts on PM2.5 in Southeastern United States. Community Modeling and Analysis System Conference, Chapel Hill, NC, 2022</w:t>
+      </w:r>
+      <w:r>
+        <w:rPr>
+          <w:b w:val="0"/>
+          <w:bCs w:val="0"/>
+          <w:sz w:val="22"/>
+          <w:szCs w:val="22"/>
+          <w:u w:val="none"/>
+        </w:rPr>
+        <w:t xml:space="preserve"> (oral)</w:t>
+      </w:r>
+      <w:r>
+        <w:rPr>
+          <w:b w:val="0"/>
+          <w:bCs w:val="0"/>
+          <w:sz w:val="22"/>
+          <w:szCs w:val="22"/>
+          <w:u w:val="none"/>
+        </w:rPr>
+        <w:t>.</w:t>
+      </w:r>
+    </w:p>
+    <w:p>
+      <w:pPr>
+        <w:pStyle w:val="Heading1"/>
+        <w:numPr>
+          <w:ilvl w:val="0"/>
+          <w:numId w:val="3"/>
+        </w:numPr>
+        <w:tabs>
+          <w:tab w:val="left" w:pos="10466"/>
+        </w:tabs>
+        <w:spacing w:before="0"/>
+        <w:jc w:val="both"/>
+        <w:rPr>
+          <w:b w:val="0"/>
+          <w:bCs w:val="0"/>
+          <w:sz w:val="22"/>
+          <w:szCs w:val="22"/>
+          <w:u w:val="none"/>
+        </w:rPr>
+      </w:pPr>
+      <w:r>
+        <w:rPr>
+          <w:sz w:val="22"/>
+          <w:szCs w:val="22"/>
+          <w:u w:val="none"/>
+        </w:rPr>
+        <w:t>Li, Z.</w:t>
+      </w:r>
+      <w:r>
+        <w:rPr>
+          <w:b w:val="0"/>
+          <w:bCs w:val="0"/>
+          <w:sz w:val="22"/>
+          <w:szCs w:val="22"/>
+          <w:u w:val="none"/>
+        </w:rPr>
+        <w:t>; Odman, M.T.; Hu, Y.; Russell, A.G. Comparisons of Air Quality Models for Prescribed Burning Simulations at a Military Base in Southeastern United States. Community Modeling and Analysis System Conference, Chapel Hill, NC, 2022</w:t>
+      </w:r>
+      <w:r>
+        <w:rPr>
+          <w:b w:val="0"/>
+          <w:bCs w:val="0"/>
+          <w:sz w:val="22"/>
+          <w:szCs w:val="22"/>
+          <w:u w:val="none"/>
+        </w:rPr>
+        <w:t xml:space="preserve"> (oral)</w:t>
+      </w:r>
+      <w:r>
+        <w:rPr>
+          <w:b w:val="0"/>
+          <w:bCs w:val="0"/>
+          <w:sz w:val="22"/>
+          <w:szCs w:val="22"/>
+          <w:u w:val="none"/>
+        </w:rPr>
+        <w:t>.</w:t>
       </w:r>
     </w:p>
     <w:p>
@@ -5217,7 +5826,27 @@
           <w:szCs w:val="22"/>
           <w:u w:val="none"/>
         </w:rPr>
-        <w:t xml:space="preserve"> Method. Community Modeling and Analysis System Conference, Chapel Hill, NC, 2021.</w:t>
+        <w:t xml:space="preserve"> Method. Community Modeling and Analysis System Conference, Chapel Hill, NC, 2021</w:t>
+      </w:r>
+      <w:r>
+        <w:rPr>
+          <w:b w:val="0"/>
+          <w:bCs w:val="0"/>
+          <w:sz w:val="22"/>
+          <w:szCs w:val="22"/>
+          <w:u w:val="none"/>
+        </w:rPr>
+        <w:t xml:space="preserve"> (oral)</w:t>
+      </w:r>
+      <w:r>
+        <w:rPr>
+          <w:b w:val="0"/>
+          <w:bCs w:val="0"/>
+          <w:sz w:val="22"/>
+          <w:szCs w:val="22"/>
+          <w:u w:val="none"/>
+        </w:rPr>
+        <w:t>.</w:t>
       </w:r>
     </w:p>
     <w:p>
@@ -5475,7 +6104,14 @@
         <w:rPr>
           <w:bCs/>
         </w:rPr>
-        <w:t>Proceedings of the National Academy of Sciences</w:t>
+        <w:t xml:space="preserve">Proceedings of the National Academy of </w:t>
+      </w:r>
+      <w:r>
+        <w:rPr>
+          <w:bCs/>
+        </w:rPr>
+        <w:lastRenderedPageBreak/>
+        <w:t>Sciences</w:t>
       </w:r>
       <w:r>
         <w:rPr>
@@ -5680,14 +6316,12 @@
         </w:rPr>
         <w:t xml:space="preserve"> </w:t>
       </w:r>
-      <w:proofErr w:type="spellStart"/>
       <w:r>
         <w:rPr>
           <w:bCs/>
         </w:rPr>
         <w:t>Volckens</w:t>
       </w:r>
-      <w:proofErr w:type="spellEnd"/>
       <w:r>
         <w:rPr>
           <w:bCs/>
@@ -5836,7 +6470,6 @@
         <w:rPr>
           <w:b/>
         </w:rPr>
-        <w:lastRenderedPageBreak/>
         <w:t>Numerical Modeling:</w:t>
       </w:r>
       <w:r>

</xml_diff>